<commit_message>
Aday adı eklendi: Dr. Bülent Tandoğan
Co-Authored-By: Claude Opus 5.5 (1M context) <noreply@anthropic.com>
</commit_message>
<xml_diff>
--- a/Kadikoy-Calisma-Raporu.docx
+++ b/Kadikoy-Calisma-Raporu.docx
@@ -96,7 +96,7 @@
           <w:sz w:val="32"/>
           <w:szCs w:val="32"/>
         </w:rPr>
-        <w:t xml:space="preserve">[Ad Soyad]</w:t>
+        <w:t xml:space="preserve">Dr. Bülent Tandoğan</w:t>
       </w:r>
     </w:p>
     <w:p>
@@ -14203,12 +14203,11 @@
           <w:sz w:val="26"/>
           <w:szCs w:val="26"/>
         </w:rPr>
-        <w:t xml:space="preserve">[Ad Soyad]</w:t>
-      </w:r>
-    </w:p>
-    <w:p>
-      <w:pPr>
-        <w:spacing w:after="40"/>
+        <w:t xml:space="preserve">Dr. Bülent Tandoğan</w:t>
+      </w:r>
+    </w:p>
+    <w:p>
+      <w:pPr>
         <w:jc w:val="right"/>
       </w:pPr>
       <w:r>
@@ -14216,19 +14215,6 @@
           <w:color w:val="6B7280"/>
         </w:rPr>
         <w:t xml:space="preserve">Yeni Parti Kadıköy İlçe Başkan Adayı</w:t>
-      </w:r>
-    </w:p>
-    <w:p>
-      <w:pPr>
-        <w:jc w:val="right"/>
-      </w:pPr>
-      <w:r>
-        <w:rPr>
-          <w:color w:val="6B7280"/>
-          <w:sz w:val="20"/>
-          <w:szCs w:val="20"/>
-        </w:rPr>
-        <w:t xml:space="preserve">[Telefon] · [E-posta] · [Sosyal medya]</w:t>
       </w:r>
     </w:p>
     <w:sectPr>

</xml_diff>

<commit_message>
Atatürk ilkeleri tablosu yerine özet paragraf
Co-Authored-By: Claude Opus 5.5 (1M context) <noreply@anthropic.com>
</commit_message>
<xml_diff>
--- a/Kadikoy-Calisma-Raporu.docx
+++ b/Kadikoy-Calisma-Raporu.docx
@@ -795,378 +795,22 @@
     </w:p>
     <w:p>
       <w:pPr>
-        <w:keepNext/>
         <w:spacing w:after="120" w:line="300"/>
         <w:jc w:val="both"/>
       </w:pPr>
       <w:r>
-        <w:t xml:space="preserve">Atatürk ilkeleri, bugün savunduğumuz sosyal demokrat değerlerin bu topraklardaki kökleridir:</w:t>
-      </w:r>
-    </w:p>
-    <w:tbl>
-      <w:tblPr>
-        <w:tblW w:type="dxa" w:w="9638"/>
-        <w:tblBorders>
-          <w:top w:val="single" w:color="D1D5DB" w:sz="4"/>
-          <w:left w:val="single" w:color="D1D5DB" w:sz="4"/>
-          <w:bottom w:val="single" w:color="D1D5DB" w:sz="4"/>
-          <w:right w:val="single" w:color="D1D5DB" w:sz="4"/>
-          <w:insideH w:val="single" w:color="D1D5DB" w:sz="4"/>
-          <w:insideV w:val="single" w:color="D1D5DB" w:sz="4"/>
-        </w:tblBorders>
-      </w:tblPr>
-      <w:tblGrid>
-        <w:gridCol w:w="2600"/>
-        <w:gridCol w:w="7038"/>
-      </w:tblGrid>
-      <w:tr>
-        <w:trPr>
-          <w:tblHeader/>
-        </w:trPr>
-        <w:tc>
-          <w:tcPr>
-            <w:tcW w:type="dxa" w:w="2600"/>
-            <w:shd w:fill="B3121D" w:color="auto" w:val="clear"/>
-            <w:tcMar>
-              <w:top w:type="dxa" w:w="80"/>
-              <w:left w:type="dxa" w:w="120"/>
-              <w:bottom w:type="dxa" w:w="80"/>
-              <w:right w:type="dxa" w:w="120"/>
-            </w:tcMar>
-          </w:tcPr>
-          <w:p>
-            <w:pPr>
-              <w:spacing w:after="0" w:line="276"/>
-            </w:pPr>
-            <w:r>
-              <w:rPr>
-                <w:b/>
-                <w:bCs/>
-                <w:color w:val="FFFFFF"/>
-              </w:rPr>
-              <w:t xml:space="preserve">Atatürk ilkesi</w:t>
-            </w:r>
-          </w:p>
-        </w:tc>
-        <w:tc>
-          <w:tcPr>
-            <w:tcW w:type="dxa" w:w="7038"/>
-            <w:shd w:fill="B3121D" w:color="auto" w:val="clear"/>
-            <w:tcMar>
-              <w:top w:type="dxa" w:w="80"/>
-              <w:left w:type="dxa" w:w="120"/>
-              <w:bottom w:type="dxa" w:w="80"/>
-              <w:right w:type="dxa" w:w="120"/>
-            </w:tcMar>
-          </w:tcPr>
-          <w:p>
-            <w:pPr>
-              <w:spacing w:after="0" w:line="276"/>
-            </w:pPr>
-            <w:r>
-              <w:rPr>
-                <w:b/>
-                <w:bCs/>
-                <w:color w:val="FFFFFF"/>
-              </w:rPr>
-              <w:t xml:space="preserve">Bugün bizim için anlamı</w:t>
-            </w:r>
-          </w:p>
-        </w:tc>
-      </w:tr>
-      <w:tr>
-        <w:trPr>
-          <w:cantSplit/>
-        </w:trPr>
-        <w:tc>
-          <w:tcPr>
-            <w:tcW w:type="dxa" w:w="2600"/>
-            <w:tcMar>
-              <w:top w:type="dxa" w:w="80"/>
-              <w:left w:type="dxa" w:w="120"/>
-              <w:bottom w:type="dxa" w:w="80"/>
-              <w:right w:type="dxa" w:w="120"/>
-            </w:tcMar>
-          </w:tcPr>
-          <w:p>
-            <w:pPr>
-              <w:spacing w:after="0" w:line="276"/>
-            </w:pPr>
-            <w:r>
-              <w:rPr>
-                <w:b/>
-                <w:bCs/>
-              </w:rPr>
-              <w:t xml:space="preserve">Cumhuriyetçilik</w:t>
-            </w:r>
-          </w:p>
-        </w:tc>
-        <w:tc>
-          <w:tcPr>
-            <w:tcW w:type="dxa" w:w="7038"/>
-            <w:tcMar>
-              <w:top w:type="dxa" w:w="80"/>
-              <w:left w:type="dxa" w:w="120"/>
-              <w:bottom w:type="dxa" w:w="80"/>
-              <w:right w:type="dxa" w:w="120"/>
-            </w:tcMar>
-          </w:tcPr>
-          <w:p>
-            <w:pPr>
-              <w:spacing w:after="0" w:line="276"/>
-            </w:pPr>
-            <w:r>
-              <w:t xml:space="preserve">Halk egemenliği, seçilmiş iradenin üstünlüğü, demokratik ve hesap verebilir yönetim</w:t>
-            </w:r>
-          </w:p>
-        </w:tc>
-      </w:tr>
-      <w:tr>
-        <w:trPr>
-          <w:cantSplit/>
-        </w:trPr>
-        <w:tc>
-          <w:tcPr>
-            <w:tcW w:type="dxa" w:w="2600"/>
-            <w:shd w:fill="F7F7F8" w:color="auto" w:val="clear"/>
-            <w:tcMar>
-              <w:top w:type="dxa" w:w="80"/>
-              <w:left w:type="dxa" w:w="120"/>
-              <w:bottom w:type="dxa" w:w="80"/>
-              <w:right w:type="dxa" w:w="120"/>
-            </w:tcMar>
-          </w:tcPr>
-          <w:p>
-            <w:pPr>
-              <w:spacing w:after="0" w:line="276"/>
-            </w:pPr>
-            <w:r>
-              <w:rPr>
-                <w:b/>
-                <w:bCs/>
-              </w:rPr>
-              <w:t xml:space="preserve">Halkçılık</w:t>
-            </w:r>
-          </w:p>
-        </w:tc>
-        <w:tc>
-          <w:tcPr>
-            <w:tcW w:type="dxa" w:w="7038"/>
-            <w:shd w:fill="F7F7F8" w:color="auto" w:val="clear"/>
-            <w:tcMar>
-              <w:top w:type="dxa" w:w="80"/>
-              <w:left w:type="dxa" w:w="120"/>
-              <w:bottom w:type="dxa" w:w="80"/>
-              <w:right w:type="dxa" w:w="120"/>
-            </w:tcMar>
-          </w:tcPr>
-          <w:p>
-            <w:pPr>
-              <w:spacing w:after="0" w:line="276"/>
-            </w:pPr>
-            <w:r>
-              <w:t xml:space="preserve">Hiçbir kişiye, aileye ya da zümreye ayrıcalık tanımayan eşit yurttaşlık; sosyal adalet ve halkın yönetime katılımı</w:t>
-            </w:r>
-          </w:p>
-        </w:tc>
-      </w:tr>
-      <w:tr>
-        <w:trPr>
-          <w:cantSplit/>
-        </w:trPr>
-        <w:tc>
-          <w:tcPr>
-            <w:tcW w:type="dxa" w:w="2600"/>
-            <w:tcMar>
-              <w:top w:type="dxa" w:w="80"/>
-              <w:left w:type="dxa" w:w="120"/>
-              <w:bottom w:type="dxa" w:w="80"/>
-              <w:right w:type="dxa" w:w="120"/>
-            </w:tcMar>
-          </w:tcPr>
-          <w:p>
-            <w:pPr>
-              <w:spacing w:after="0" w:line="276"/>
-            </w:pPr>
-            <w:r>
-              <w:rPr>
-                <w:b/>
-                <w:bCs/>
-              </w:rPr>
-              <w:t xml:space="preserve">Laiklik</w:t>
-            </w:r>
-          </w:p>
-        </w:tc>
-        <w:tc>
-          <w:tcPr>
-            <w:tcW w:type="dxa" w:w="7038"/>
-            <w:tcMar>
-              <w:top w:type="dxa" w:w="80"/>
-              <w:left w:type="dxa" w:w="120"/>
-              <w:bottom w:type="dxa" w:w="80"/>
-              <w:right w:type="dxa" w:w="120"/>
-            </w:tcMar>
-          </w:tcPr>
-          <w:p>
-            <w:pPr>
-              <w:spacing w:after="0" w:line="276"/>
-            </w:pPr>
-            <w:r>
-              <w:t xml:space="preserve">Din ve vicdan özgürlüğünün güvencesi; kamusal hayatın akıl ve bilimle yönetilmesi</w:t>
-            </w:r>
-          </w:p>
-        </w:tc>
-      </w:tr>
-      <w:tr>
-        <w:trPr>
-          <w:cantSplit/>
-        </w:trPr>
-        <w:tc>
-          <w:tcPr>
-            <w:tcW w:type="dxa" w:w="2600"/>
-            <w:shd w:fill="F7F7F8" w:color="auto" w:val="clear"/>
-            <w:tcMar>
-              <w:top w:type="dxa" w:w="80"/>
-              <w:left w:type="dxa" w:w="120"/>
-              <w:bottom w:type="dxa" w:w="80"/>
-              <w:right w:type="dxa" w:w="120"/>
-            </w:tcMar>
-          </w:tcPr>
-          <w:p>
-            <w:pPr>
-              <w:spacing w:after="0" w:line="276"/>
-            </w:pPr>
-            <w:r>
-              <w:rPr>
-                <w:b/>
-                <w:bCs/>
-              </w:rPr>
-              <w:t xml:space="preserve">Milliyetçilik</w:t>
-            </w:r>
-          </w:p>
-        </w:tc>
-        <w:tc>
-          <w:tcPr>
-            <w:tcW w:type="dxa" w:w="7038"/>
-            <w:shd w:fill="F7F7F8" w:color="auto" w:val="clear"/>
-            <w:tcMar>
-              <w:top w:type="dxa" w:w="80"/>
-              <w:left w:type="dxa" w:w="120"/>
-              <w:bottom w:type="dxa" w:w="80"/>
-              <w:right w:type="dxa" w:w="120"/>
-            </w:tcMar>
-          </w:tcPr>
-          <w:p>
-            <w:pPr>
-              <w:spacing w:after="0" w:line="276"/>
-            </w:pPr>
-            <w:r>
-              <w:t xml:space="preserve">Ortak vatanda, eşit ve özgür yurttaşlık bağına dayanan birlik ve dayanışma</w:t>
-            </w:r>
-          </w:p>
-        </w:tc>
-      </w:tr>
-      <w:tr>
-        <w:trPr>
-          <w:cantSplit/>
-        </w:trPr>
-        <w:tc>
-          <w:tcPr>
-            <w:tcW w:type="dxa" w:w="2600"/>
-            <w:tcMar>
-              <w:top w:type="dxa" w:w="80"/>
-              <w:left w:type="dxa" w:w="120"/>
-              <w:bottom w:type="dxa" w:w="80"/>
-              <w:right w:type="dxa" w:w="120"/>
-            </w:tcMar>
-          </w:tcPr>
-          <w:p>
-            <w:pPr>
-              <w:spacing w:after="0" w:line="276"/>
-            </w:pPr>
-            <w:r>
-              <w:rPr>
-                <w:b/>
-                <w:bCs/>
-              </w:rPr>
-              <w:t xml:space="preserve">Devletçilik</w:t>
-            </w:r>
-          </w:p>
-        </w:tc>
-        <w:tc>
-          <w:tcPr>
-            <w:tcW w:type="dxa" w:w="7038"/>
-            <w:tcMar>
-              <w:top w:type="dxa" w:w="80"/>
-              <w:left w:type="dxa" w:w="120"/>
-              <w:bottom w:type="dxa" w:w="80"/>
-              <w:right w:type="dxa" w:w="120"/>
-            </w:tcMar>
-          </w:tcPr>
-          <w:p>
-            <w:pPr>
-              <w:spacing w:after="0" w:line="276"/>
-            </w:pPr>
-            <w:r>
-              <w:t xml:space="preserve">Kalkınmada ve temel hizmetlerde kamunun sorumluluğu; bugünkü karşılığıyla kamuculuk ve sosyal devlet</w:t>
-            </w:r>
-          </w:p>
-        </w:tc>
-      </w:tr>
-      <w:tr>
-        <w:trPr>
-          <w:cantSplit/>
-        </w:trPr>
-        <w:tc>
-          <w:tcPr>
-            <w:tcW w:type="dxa" w:w="2600"/>
-            <w:shd w:fill="F7F7F8" w:color="auto" w:val="clear"/>
-            <w:tcMar>
-              <w:top w:type="dxa" w:w="80"/>
-              <w:left w:type="dxa" w:w="120"/>
-              <w:bottom w:type="dxa" w:w="80"/>
-              <w:right w:type="dxa" w:w="120"/>
-            </w:tcMar>
-          </w:tcPr>
-          <w:p>
-            <w:pPr>
-              <w:spacing w:after="0" w:line="276"/>
-            </w:pPr>
-            <w:r>
-              <w:rPr>
-                <w:b/>
-                <w:bCs/>
-              </w:rPr>
-              <w:t xml:space="preserve">İnkılapçılık</w:t>
-            </w:r>
-          </w:p>
-        </w:tc>
-        <w:tc>
-          <w:tcPr>
-            <w:tcW w:type="dxa" w:w="7038"/>
-            <w:shd w:fill="F7F7F8" w:color="auto" w:val="clear"/>
-            <w:tcMar>
-              <w:top w:type="dxa" w:w="80"/>
-              <w:left w:type="dxa" w:w="120"/>
-              <w:bottom w:type="dxa" w:w="80"/>
-              <w:right w:type="dxa" w:w="120"/>
-            </w:tcMar>
-          </w:tcPr>
-          <w:p>
-            <w:pPr>
-              <w:spacing w:after="0" w:line="276"/>
-            </w:pPr>
-            <w:r>
-              <w:t xml:space="preserve">Çağdaşlaşmanın, aydınlanmanın ve toplumsal yenilenmenin sürekliliği</w:t>
-            </w:r>
-          </w:p>
-        </w:tc>
-      </w:tr>
-    </w:tbl>
-    <w:p>
-      <w:pPr>
-        <w:spacing w:after="120"/>
-      </w:pPr>
+        <w:t xml:space="preserve">Atatürk ilkeleri; halk egemenliği, eşit yurttaşlık, laiklik, sosyal adalet ve çağdaşlaşma ülküsüyle bugün savunduğumuz sosyal demokrat değerlerin bu topraklardaki kökleridir. Biz bu ilkeleri yalnızca geçmişin bir mirası olarak değil, </w:t>
+      </w:r>
+      <w:r>
+        <w:rPr>
+          <w:b/>
+          <w:bCs/>
+        </w:rPr>
+        <w:t xml:space="preserve">demokratik, laik ve sosyal bir geleceği kurmanın pusulası</w:t>
+      </w:r>
+      <w:r>
+        <w:t xml:space="preserve"> olarak görüyoruz.</w:t>
+      </w:r>
     </w:p>
     <w:p>
       <w:pPr>

</xml_diff>

<commit_message>
Çağrı metninden kesim listesi çıkarıldı
Co-Authored-By: Claude Opus 5.5 (1M context) <noreply@anthropic.com>
</commit_message>
<xml_diff>
--- a/Kadikoy-Calisma-Raporu.docx
+++ b/Kadikoy-Calisma-Raporu.docx
@@ -713,33 +713,6 @@
             </w:r>
             <w:r>
               <w:t xml:space="preserve">; 3 ayda bir üyelere faaliyet ve mali rapor.</w:t>
-            </w:r>
-          </w:p>
-          <w:p>
-            <w:pPr>
-              <w:pStyle w:val="ListParagraph"/>
-              <w:numPr>
-                <w:ilvl w:val="0"/>
-                <w:numId w:val="2"/>
-              </w:numPr>
-              <w:spacing w:after="60" w:line="288"/>
-            </w:pPr>
-            <w:r>
-              <w:rPr>
-                <w:b/>
-                <w:bCs/>
-              </w:rPr>
-              <w:t xml:space="preserve">Tüm demokratlara çağrı:</w:t>
-            </w:r>
-            <w:r>
-              <w:t xml:space="preserve"> Sosyal demokratlara, muhafazakâr demokratlara, sosyalist demokratlara ve Kürt demokratlara açık bir kapı. </w:t>
-            </w:r>
-            <w:r>
-              <w:rPr>
-                <w:b/>
-                <w:bCs/>
-              </w:rPr>
-              <w:t xml:space="preserve">“Demokrasiyi Yeni Parti'den başlatacağız!”</w:t>
             </w:r>
           </w:p>
         </w:tc>
@@ -13758,14 +13731,7 @@
               <w:jc w:val="left"/>
             </w:pPr>
             <w:r>
-              <w:rPr>
-                <w:b/>
-                <w:bCs/>
-              </w:rPr>
-              <w:t xml:space="preserve">Sosyal demokratlara, muhafazakâr demokratlara, sosyalist demokratlara, Kürt demokratlara;</w:t>
-            </w:r>
-            <w:r>
-              <w:t xml:space="preserve"> demokrasiye, hukukun üstünlüğüne, özgürlüğe ve eşit yurttaşlığa inanan herkese sesleniyorum.</w:t>
+              <w:t xml:space="preserve">Demokrasiye, hukukun üstünlüğüne, özgürlüğe ve eşit yurttaşlığa inanan herkese sesleniyorum.</w:t>
             </w:r>
           </w:p>
           <w:p>

</xml_diff>